<commit_message>
docs: embed 14 fresh v3.21 screenshots in user manual .docx
Captured screenshots from the live v3.21 app and embedded them at their
section anchors: login, Quick Find (entry + results), Start Operation,
Operations tab, Add Shore Point, shore card, Command tab, ICS org chart,
Cut Table, Inventory, Settings, plus two desktop split-view shots
(Command + Operations). Source PNGs kept in docs/manual-assets/ so the
build script can re-embed them on future rebuilds.

The .docx now carries current text AND current visuals, matching the app
at v3.21. Replaces the stale v3.7 screenshots from the prior .docx.
</commit_message>
<xml_diff>
--- a/docs/FieldStruts-User-Manual.docx
+++ b/docs/FieldStruts-User-Manual.docx
@@ -491,6 +491,60 @@
     </w:p>
     <w:p>
       <w:pPr>
+        <w:spacing w:before="120"/>
+        <w:jc w:val="center"/>
+      </w:pPr>
+      <w:r>
+        <w:drawing>
+          <wp:inline xmlns:a="http://schemas.openxmlformats.org/drawingml/2006/main" xmlns:pic="http://schemas.openxmlformats.org/drawingml/2006/picture">
+            <wp:extent cx="2651760" cy="5739075"/>
+            <wp:docPr id="1" name="Picture 1"/>
+            <wp:cNvGraphicFramePr>
+              <a:graphicFrameLocks noChangeAspect="1"/>
+            </wp:cNvGraphicFramePr>
+            <a:graphic>
+              <a:graphicData uri="http://schemas.openxmlformats.org/drawingml/2006/picture">
+                <pic:pic>
+                  <pic:nvPicPr>
+                    <pic:cNvPr id="0" name="01-login.png"/>
+                    <pic:cNvPicPr/>
+                  </pic:nvPicPr>
+                  <pic:blipFill>
+                    <a:blip r:embed="rId9"/>
+                    <a:stretch>
+                      <a:fillRect/>
+                    </a:stretch>
+                  </pic:blipFill>
+                  <pic:spPr>
+                    <a:xfrm>
+                      <a:off x="0" y="0"/>
+                      <a:ext cx="2651760" cy="5739075"/>
+                    </a:xfrm>
+                    <a:prstGeom prst="rect"/>
+                  </pic:spPr>
+                </pic:pic>
+              </a:graphicData>
+            </a:graphic>
+          </wp:inline>
+        </w:drawing>
+      </w:r>
+    </w:p>
+    <w:p>
+      <w:pPr>
+        <w:spacing w:after="200"/>
+        <w:jc w:val="center"/>
+      </w:pPr>
+      <w:r>
+        <w:rPr>
+          <w:i/>
+          <w:color w:val="555555"/>
+          <w:sz w:val="18"/>
+        </w:rPr>
+        <w:t>The Department ID login screen.</w:t>
+      </w:r>
+    </w:p>
+    <w:p>
+      <w:pPr>
         <w:pStyle w:val="Heading2"/>
       </w:pPr>
       <w:r>
@@ -634,6 +688,114 @@
     </w:p>
     <w:p>
       <w:pPr>
+        <w:spacing w:before="120"/>
+        <w:jc w:val="center"/>
+      </w:pPr>
+      <w:r>
+        <w:drawing>
+          <wp:inline xmlns:a="http://schemas.openxmlformats.org/drawingml/2006/main" xmlns:pic="http://schemas.openxmlformats.org/drawingml/2006/picture">
+            <wp:extent cx="5486400" cy="3857625"/>
+            <wp:docPr id="2" name="Picture 2"/>
+            <wp:cNvGraphicFramePr>
+              <a:graphicFrameLocks noChangeAspect="1"/>
+            </wp:cNvGraphicFramePr>
+            <a:graphic>
+              <a:graphicData uri="http://schemas.openxmlformats.org/drawingml/2006/picture">
+                <pic:pic>
+                  <pic:nvPicPr>
+                    <pic:cNvPr id="0" name="13-desktop-command.png"/>
+                    <pic:cNvPicPr/>
+                  </pic:nvPicPr>
+                  <pic:blipFill>
+                    <a:blip r:embed="rId10"/>
+                    <a:stretch>
+                      <a:fillRect/>
+                    </a:stretch>
+                  </pic:blipFill>
+                  <pic:spPr>
+                    <a:xfrm>
+                      <a:off x="0" y="0"/>
+                      <a:ext cx="5486400" cy="3857625"/>
+                    </a:xfrm>
+                    <a:prstGeom prst="rect"/>
+                  </pic:spPr>
+                </pic:pic>
+              </a:graphicData>
+            </a:graphic>
+          </wp:inline>
+        </w:drawing>
+      </w:r>
+    </w:p>
+    <w:p>
+      <w:pPr>
+        <w:spacing w:after="200"/>
+        <w:jc w:val="center"/>
+      </w:pPr>
+      <w:r>
+        <w:rPr>
+          <w:i/>
+          <w:color w:val="555555"/>
+          <w:sz w:val="18"/>
+        </w:rPr>
+        <w:t>Desktop view — Command tab split layout.</w:t>
+      </w:r>
+    </w:p>
+    <w:p>
+      <w:pPr>
+        <w:spacing w:before="120"/>
+        <w:jc w:val="center"/>
+      </w:pPr>
+      <w:r>
+        <w:drawing>
+          <wp:inline xmlns:a="http://schemas.openxmlformats.org/drawingml/2006/main" xmlns:pic="http://schemas.openxmlformats.org/drawingml/2006/picture">
+            <wp:extent cx="5486400" cy="3857625"/>
+            <wp:docPr id="3" name="Picture 3"/>
+            <wp:cNvGraphicFramePr>
+              <a:graphicFrameLocks noChangeAspect="1"/>
+            </wp:cNvGraphicFramePr>
+            <a:graphic>
+              <a:graphicData uri="http://schemas.openxmlformats.org/drawingml/2006/picture">
+                <pic:pic>
+                  <pic:nvPicPr>
+                    <pic:cNvPr id="0" name="14-desktop-operations.png"/>
+                    <pic:cNvPicPr/>
+                  </pic:nvPicPr>
+                  <pic:blipFill>
+                    <a:blip r:embed="rId11"/>
+                    <a:stretch>
+                      <a:fillRect/>
+                    </a:stretch>
+                  </pic:blipFill>
+                  <pic:spPr>
+                    <a:xfrm>
+                      <a:off x="0" y="0"/>
+                      <a:ext cx="5486400" cy="3857625"/>
+                    </a:xfrm>
+                    <a:prstGeom prst="rect"/>
+                  </pic:spPr>
+                </pic:pic>
+              </a:graphicData>
+            </a:graphic>
+          </wp:inline>
+        </w:drawing>
+      </w:r>
+    </w:p>
+    <w:p>
+      <w:pPr>
+        <w:spacing w:after="200"/>
+        <w:jc w:val="center"/>
+      </w:pPr>
+      <w:r>
+        <w:rPr>
+          <w:i/>
+          <w:color w:val="555555"/>
+          <w:sz w:val="18"/>
+        </w:rPr>
+        <w:t>Desktop view — Operations tab with drilldown sidebar.</w:t>
+      </w:r>
+    </w:p>
+    <w:p>
+      <w:pPr>
         <w:pStyle w:val="Heading1"/>
       </w:pPr>
       <w:r>
@@ -770,19 +932,73 @@
     </w:p>
     <w:p>
       <w:pPr>
-        <w:pStyle w:val="Heading2"/>
-      </w:pPr>
-      <w:r>
-        <w:t>Results</w:t>
+        <w:spacing w:before="120"/>
+        <w:jc w:val="center"/>
+      </w:pPr>
+      <w:r>
+        <w:drawing>
+          <wp:inline xmlns:a="http://schemas.openxmlformats.org/drawingml/2006/main" xmlns:pic="http://schemas.openxmlformats.org/drawingml/2006/picture">
+            <wp:extent cx="2651760" cy="5739075"/>
+            <wp:docPr id="4" name="Picture 4"/>
+            <wp:cNvGraphicFramePr>
+              <a:graphicFrameLocks noChangeAspect="1"/>
+            </wp:cNvGraphicFramePr>
+            <a:graphic>
+              <a:graphicData uri="http://schemas.openxmlformats.org/drawingml/2006/picture">
+                <pic:pic>
+                  <pic:nvPicPr>
+                    <pic:cNvPr id="0" name="02-quickfind.png"/>
+                    <pic:cNvPicPr/>
+                  </pic:nvPicPr>
+                  <pic:blipFill>
+                    <a:blip r:embed="rId12"/>
+                    <a:stretch>
+                      <a:fillRect/>
+                    </a:stretch>
+                  </pic:blipFill>
+                  <pic:spPr>
+                    <a:xfrm>
+                      <a:off x="0" y="0"/>
+                      <a:ext cx="2651760" cy="5739075"/>
+                    </a:xfrm>
+                    <a:prstGeom prst="rect"/>
+                  </pic:spPr>
+                </pic:pic>
+              </a:graphicData>
+            </a:graphic>
+          </wp:inline>
+        </w:drawing>
       </w:r>
     </w:p>
     <w:p>
-      <w:r>
-        <w:t>The app returns all strut and extension combinations that fit the measurement, ranked by safety factor. Each result card shows:</w:t>
+      <w:pPr>
+        <w:spacing w:after="200"/>
+        <w:jc w:val="center"/>
+      </w:pPr>
+      <w:r>
+        <w:rPr>
+          <w:i/>
+          <w:color w:val="555555"/>
+          <w:sz w:val="18"/>
+        </w:rPr>
+        <w:t>Quick Find — entering a measurement and load.</w:t>
       </w:r>
     </w:p>
     <w:p>
       <w:pPr>
+        <w:pStyle w:val="Heading2"/>
+      </w:pPr>
+      <w:r>
+        <w:t>Results</w:t>
+      </w:r>
+    </w:p>
+    <w:p>
+      <w:r>
+        <w:t>The app returns all strut and extension combinations that fit the measurement, ranked by safety factor. Each result card shows:</w:t>
+      </w:r>
+    </w:p>
+    <w:p>
+      <w:pPr>
         <w:spacing w:after="40"/>
         <w:ind w:left="432" w:hanging="288"/>
       </w:pPr>
@@ -831,6 +1047,60 @@
       </w:r>
       <w:r>
         <w:t>Whether the combination is within safe working limits for the entered load</w:t>
+      </w:r>
+    </w:p>
+    <w:p>
+      <w:pPr>
+        <w:spacing w:before="120"/>
+        <w:jc w:val="center"/>
+      </w:pPr>
+      <w:r>
+        <w:drawing>
+          <wp:inline xmlns:a="http://schemas.openxmlformats.org/drawingml/2006/main" xmlns:pic="http://schemas.openxmlformats.org/drawingml/2006/picture">
+            <wp:extent cx="2651760" cy="5739075"/>
+            <wp:docPr id="5" name="Picture 5"/>
+            <wp:cNvGraphicFramePr>
+              <a:graphicFrameLocks noChangeAspect="1"/>
+            </wp:cNvGraphicFramePr>
+            <a:graphic>
+              <a:graphicData uri="http://schemas.openxmlformats.org/drawingml/2006/picture">
+                <pic:pic>
+                  <pic:nvPicPr>
+                    <pic:cNvPr id="0" name="03-quickfind-results.png"/>
+                    <pic:cNvPicPr/>
+                  </pic:nvPicPr>
+                  <pic:blipFill>
+                    <a:blip r:embed="rId13"/>
+                    <a:stretch>
+                      <a:fillRect/>
+                    </a:stretch>
+                  </pic:blipFill>
+                  <pic:spPr>
+                    <a:xfrm>
+                      <a:off x="0" y="0"/>
+                      <a:ext cx="2651760" cy="5739075"/>
+                    </a:xfrm>
+                    <a:prstGeom prst="rect"/>
+                  </pic:spPr>
+                </pic:pic>
+              </a:graphicData>
+            </a:graphic>
+          </wp:inline>
+        </w:drawing>
+      </w:r>
+    </w:p>
+    <w:p>
+      <w:pPr>
+        <w:spacing w:after="200"/>
+        <w:jc w:val="center"/>
+      </w:pPr>
+      <w:r>
+        <w:rPr>
+          <w:i/>
+          <w:color w:val="555555"/>
+          <w:sz w:val="18"/>
+        </w:rPr>
+        <w:t>Quick Find results, ranked by safety factor.</w:t>
       </w:r>
     </w:p>
     <w:p>
@@ -1210,6 +1480,114 @@
     </w:p>
     <w:p>
       <w:pPr>
+        <w:spacing w:before="120"/>
+        <w:jc w:val="center"/>
+      </w:pPr>
+      <w:r>
+        <w:drawing>
+          <wp:inline xmlns:a="http://schemas.openxmlformats.org/drawingml/2006/main" xmlns:pic="http://schemas.openxmlformats.org/drawingml/2006/picture">
+            <wp:extent cx="2651760" cy="5739075"/>
+            <wp:docPr id="6" name="Picture 6"/>
+            <wp:cNvGraphicFramePr>
+              <a:graphicFrameLocks noChangeAspect="1"/>
+            </wp:cNvGraphicFramePr>
+            <a:graphic>
+              <a:graphicData uri="http://schemas.openxmlformats.org/drawingml/2006/picture">
+                <pic:pic>
+                  <pic:nvPicPr>
+                    <pic:cNvPr id="0" name="04-start-operation.png"/>
+                    <pic:cNvPicPr/>
+                  </pic:nvPicPr>
+                  <pic:blipFill>
+                    <a:blip r:embed="rId14"/>
+                    <a:stretch>
+                      <a:fillRect/>
+                    </a:stretch>
+                  </pic:blipFill>
+                  <pic:spPr>
+                    <a:xfrm>
+                      <a:off x="0" y="0"/>
+                      <a:ext cx="2651760" cy="5739075"/>
+                    </a:xfrm>
+                    <a:prstGeom prst="rect"/>
+                  </pic:spPr>
+                </pic:pic>
+              </a:graphicData>
+            </a:graphic>
+          </wp:inline>
+        </w:drawing>
+      </w:r>
+    </w:p>
+    <w:p>
+      <w:pPr>
+        <w:spacing w:after="200"/>
+        <w:jc w:val="center"/>
+      </w:pPr>
+      <w:r>
+        <w:rPr>
+          <w:i/>
+          <w:color w:val="555555"/>
+          <w:sz w:val="18"/>
+        </w:rPr>
+        <w:t>The Start New Operation form.</w:t>
+      </w:r>
+    </w:p>
+    <w:p>
+      <w:pPr>
+        <w:spacing w:before="120"/>
+        <w:jc w:val="center"/>
+      </w:pPr>
+      <w:r>
+        <w:drawing>
+          <wp:inline xmlns:a="http://schemas.openxmlformats.org/drawingml/2006/main" xmlns:pic="http://schemas.openxmlformats.org/drawingml/2006/picture">
+            <wp:extent cx="2651760" cy="5739075"/>
+            <wp:docPr id="7" name="Picture 7"/>
+            <wp:cNvGraphicFramePr>
+              <a:graphicFrameLocks noChangeAspect="1"/>
+            </wp:cNvGraphicFramePr>
+            <a:graphic>
+              <a:graphicData uri="http://schemas.openxmlformats.org/drawingml/2006/picture">
+                <pic:pic>
+                  <pic:nvPicPr>
+                    <pic:cNvPr id="0" name="05-operations-tab.png"/>
+                    <pic:cNvPicPr/>
+                  </pic:nvPicPr>
+                  <pic:blipFill>
+                    <a:blip r:embed="rId15"/>
+                    <a:stretch>
+                      <a:fillRect/>
+                    </a:stretch>
+                  </pic:blipFill>
+                  <pic:spPr>
+                    <a:xfrm>
+                      <a:off x="0" y="0"/>
+                      <a:ext cx="2651760" cy="5739075"/>
+                    </a:xfrm>
+                    <a:prstGeom prst="rect"/>
+                  </pic:spPr>
+                </pic:pic>
+              </a:graphicData>
+            </a:graphic>
+          </wp:inline>
+        </w:drawing>
+      </w:r>
+    </w:p>
+    <w:p>
+      <w:pPr>
+        <w:spacing w:after="200"/>
+        <w:jc w:val="center"/>
+      </w:pPr>
+      <w:r>
+        <w:rPr>
+          <w:i/>
+          <w:color w:val="555555"/>
+          <w:sz w:val="18"/>
+        </w:rPr>
+        <w:t>The Operations tab with an active operation.</w:t>
+      </w:r>
+    </w:p>
+    <w:p>
+      <w:pPr>
         <w:pStyle w:val="Heading2"/>
       </w:pPr>
       <w:r>
@@ -1575,6 +1953,60 @@
       </w:r>
       <w:r>
         <w:t xml:space="preserve"> to search inventory and deploy matching equipment.</w:t>
+      </w:r>
+    </w:p>
+    <w:p>
+      <w:pPr>
+        <w:spacing w:before="120"/>
+        <w:jc w:val="center"/>
+      </w:pPr>
+      <w:r>
+        <w:drawing>
+          <wp:inline xmlns:a="http://schemas.openxmlformats.org/drawingml/2006/main" xmlns:pic="http://schemas.openxmlformats.org/drawingml/2006/picture">
+            <wp:extent cx="2651760" cy="5739075"/>
+            <wp:docPr id="8" name="Picture 8"/>
+            <wp:cNvGraphicFramePr>
+              <a:graphicFrameLocks noChangeAspect="1"/>
+            </wp:cNvGraphicFramePr>
+            <a:graphic>
+              <a:graphicData uri="http://schemas.openxmlformats.org/drawingml/2006/picture">
+                <pic:pic>
+                  <pic:nvPicPr>
+                    <pic:cNvPr id="0" name="06-add-shore-point.png"/>
+                    <pic:cNvPicPr/>
+                  </pic:nvPicPr>
+                  <pic:blipFill>
+                    <a:blip r:embed="rId16"/>
+                    <a:stretch>
+                      <a:fillRect/>
+                    </a:stretch>
+                  </pic:blipFill>
+                  <pic:spPr>
+                    <a:xfrm>
+                      <a:off x="0" y="0"/>
+                      <a:ext cx="2651760" cy="5739075"/>
+                    </a:xfrm>
+                    <a:prstGeom prst="rect"/>
+                  </pic:spPr>
+                </pic:pic>
+              </a:graphicData>
+            </a:graphic>
+          </wp:inline>
+        </w:drawing>
+      </w:r>
+    </w:p>
+    <w:p>
+      <w:pPr>
+        <w:spacing w:after="200"/>
+        <w:jc w:val="center"/>
+      </w:pPr>
+      <w:r>
+        <w:rPr>
+          <w:i/>
+          <w:color w:val="555555"/>
+          <w:sz w:val="18"/>
+        </w:rPr>
+        <w:t>The Add Shore Point form.</w:t>
       </w:r>
     </w:p>
     <w:p>
@@ -1941,6 +2373,60 @@
     </w:p>
     <w:p>
       <w:pPr>
+        <w:spacing w:before="120"/>
+        <w:jc w:val="center"/>
+      </w:pPr>
+      <w:r>
+        <w:drawing>
+          <wp:inline xmlns:a="http://schemas.openxmlformats.org/drawingml/2006/main" xmlns:pic="http://schemas.openxmlformats.org/drawingml/2006/picture">
+            <wp:extent cx="2651760" cy="5739075"/>
+            <wp:docPr id="9" name="Picture 9"/>
+            <wp:cNvGraphicFramePr>
+              <a:graphicFrameLocks noChangeAspect="1"/>
+            </wp:cNvGraphicFramePr>
+            <a:graphic>
+              <a:graphicData uri="http://schemas.openxmlformats.org/drawingml/2006/picture">
+                <pic:pic>
+                  <pic:nvPicPr>
+                    <pic:cNvPr id="0" name="07-shore-card.png"/>
+                    <pic:cNvPicPr/>
+                  </pic:nvPicPr>
+                  <pic:blipFill>
+                    <a:blip r:embed="rId17"/>
+                    <a:stretch>
+                      <a:fillRect/>
+                    </a:stretch>
+                  </pic:blipFill>
+                  <pic:spPr>
+                    <a:xfrm>
+                      <a:off x="0" y="0"/>
+                      <a:ext cx="2651760" cy="5739075"/>
+                    </a:xfrm>
+                    <a:prstGeom prst="rect"/>
+                  </pic:spPr>
+                </pic:pic>
+              </a:graphicData>
+            </a:graphic>
+          </wp:inline>
+        </w:drawing>
+      </w:r>
+    </w:p>
+    <w:p>
+      <w:pPr>
+        <w:spacing w:after="200"/>
+        <w:jc w:val="center"/>
+      </w:pPr>
+      <w:r>
+        <w:rPr>
+          <w:i/>
+          <w:color w:val="555555"/>
+          <w:sz w:val="18"/>
+        </w:rPr>
+        <w:t>A shore point card with its status badge and actions.</w:t>
+      </w:r>
+    </w:p>
+    <w:p>
+      <w:pPr>
         <w:pStyle w:val="Heading2"/>
       </w:pPr>
       <w:r>
@@ -2603,6 +3089,60 @@
       </w:r>
       <w:r>
         <w:t xml:space="preserve"> — Log and track scene hazards (see below).</w:t>
+      </w:r>
+    </w:p>
+    <w:p>
+      <w:pPr>
+        <w:spacing w:before="120"/>
+        <w:jc w:val="center"/>
+      </w:pPr>
+      <w:r>
+        <w:drawing>
+          <wp:inline xmlns:a="http://schemas.openxmlformats.org/drawingml/2006/main" xmlns:pic="http://schemas.openxmlformats.org/drawingml/2006/picture">
+            <wp:extent cx="2651760" cy="5739075"/>
+            <wp:docPr id="10" name="Picture 10"/>
+            <wp:cNvGraphicFramePr>
+              <a:graphicFrameLocks noChangeAspect="1"/>
+            </wp:cNvGraphicFramePr>
+            <a:graphic>
+              <a:graphicData uri="http://schemas.openxmlformats.org/drawingml/2006/picture">
+                <pic:pic>
+                  <pic:nvPicPr>
+                    <pic:cNvPr id="0" name="08-command-tab.png"/>
+                    <pic:cNvPicPr/>
+                  </pic:nvPicPr>
+                  <pic:blipFill>
+                    <a:blip r:embed="rId18"/>
+                    <a:stretch>
+                      <a:fillRect/>
+                    </a:stretch>
+                  </pic:blipFill>
+                  <pic:spPr>
+                    <a:xfrm>
+                      <a:off x="0" y="0"/>
+                      <a:ext cx="2651760" cy="5739075"/>
+                    </a:xfrm>
+                    <a:prstGeom prst="rect"/>
+                  </pic:spPr>
+                </pic:pic>
+              </a:graphicData>
+            </a:graphic>
+          </wp:inline>
+        </w:drawing>
+      </w:r>
+    </w:p>
+    <w:p>
+      <w:pPr>
+        <w:spacing w:after="200"/>
+        <w:jc w:val="center"/>
+      </w:pPr>
+      <w:r>
+        <w:rPr>
+          <w:i/>
+          <w:color w:val="555555"/>
+          <w:sz w:val="18"/>
+        </w:rPr>
+        <w:t>The Command tab — dashboard tiles and sections.</w:t>
       </w:r>
     </w:p>
     <w:p>
@@ -2878,6 +3418,60 @@
     </w:p>
     <w:p>
       <w:pPr>
+        <w:spacing w:before="120"/>
+        <w:jc w:val="center"/>
+      </w:pPr>
+      <w:r>
+        <w:drawing>
+          <wp:inline xmlns:a="http://schemas.openxmlformats.org/drawingml/2006/main" xmlns:pic="http://schemas.openxmlformats.org/drawingml/2006/picture">
+            <wp:extent cx="2651760" cy="5739075"/>
+            <wp:docPr id="11" name="Picture 11"/>
+            <wp:cNvGraphicFramePr>
+              <a:graphicFrameLocks noChangeAspect="1"/>
+            </wp:cNvGraphicFramePr>
+            <a:graphic>
+              <a:graphicData uri="http://schemas.openxmlformats.org/drawingml/2006/picture">
+                <pic:pic>
+                  <pic:nvPicPr>
+                    <pic:cNvPr id="0" name="09-org-chart.png"/>
+                    <pic:cNvPicPr/>
+                  </pic:nvPicPr>
+                  <pic:blipFill>
+                    <a:blip r:embed="rId19"/>
+                    <a:stretch>
+                      <a:fillRect/>
+                    </a:stretch>
+                  </pic:blipFill>
+                  <pic:spPr>
+                    <a:xfrm>
+                      <a:off x="0" y="0"/>
+                      <a:ext cx="2651760" cy="5739075"/>
+                    </a:xfrm>
+                    <a:prstGeom prst="rect"/>
+                  </pic:spPr>
+                </pic:pic>
+              </a:graphicData>
+            </a:graphic>
+          </wp:inline>
+        </w:drawing>
+      </w:r>
+    </w:p>
+    <w:p>
+      <w:pPr>
+        <w:spacing w:after="200"/>
+        <w:jc w:val="center"/>
+      </w:pPr>
+      <w:r>
+        <w:rPr>
+          <w:i/>
+          <w:color w:val="555555"/>
+          <w:sz w:val="18"/>
+        </w:rPr>
+        <w:t>The ICS Organization chart (default hierarchy).</w:t>
+      </w:r>
+    </w:p>
+    <w:p>
+      <w:pPr>
         <w:pStyle w:val="Heading3"/>
       </w:pPr>
       <w:r>
@@ -3683,6 +4277,60 @@
     </w:p>
     <w:p>
       <w:pPr>
+        <w:spacing w:before="120"/>
+        <w:jc w:val="center"/>
+      </w:pPr>
+      <w:r>
+        <w:drawing>
+          <wp:inline xmlns:a="http://schemas.openxmlformats.org/drawingml/2006/main" xmlns:pic="http://schemas.openxmlformats.org/drawingml/2006/picture">
+            <wp:extent cx="2651760" cy="5739075"/>
+            <wp:docPr id="12" name="Picture 12"/>
+            <wp:cNvGraphicFramePr>
+              <a:graphicFrameLocks noChangeAspect="1"/>
+            </wp:cNvGraphicFramePr>
+            <a:graphic>
+              <a:graphicData uri="http://schemas.openxmlformats.org/drawingml/2006/picture">
+                <pic:pic>
+                  <pic:nvPicPr>
+                    <pic:cNvPr id="0" name="10-cut-table.png"/>
+                    <pic:cNvPicPr/>
+                  </pic:nvPicPr>
+                  <pic:blipFill>
+                    <a:blip r:embed="rId20"/>
+                    <a:stretch>
+                      <a:fillRect/>
+                    </a:stretch>
+                  </pic:blipFill>
+                  <pic:spPr>
+                    <a:xfrm>
+                      <a:off x="0" y="0"/>
+                      <a:ext cx="2651760" cy="5739075"/>
+                    </a:xfrm>
+                    <a:prstGeom prst="rect"/>
+                  </pic:spPr>
+                </pic:pic>
+              </a:graphicData>
+            </a:graphic>
+          </wp:inline>
+        </w:drawing>
+      </w:r>
+    </w:p>
+    <w:p>
+      <w:pPr>
+        <w:spacing w:after="200"/>
+        <w:jc w:val="center"/>
+      </w:pPr>
+      <w:r>
+        <w:rPr>
+          <w:i/>
+          <w:color w:val="555555"/>
+          <w:sz w:val="18"/>
+        </w:rPr>
+        <w:t>The Cut Table view.</w:t>
+      </w:r>
+    </w:p>
+    <w:p>
+      <w:pPr>
         <w:pStyle w:val="Heading1"/>
       </w:pPr>
       <w:r>
@@ -3705,6 +4353,60 @@
     </w:p>
     <w:p>
       <w:pPr>
+        <w:spacing w:before="120"/>
+        <w:jc w:val="center"/>
+      </w:pPr>
+      <w:r>
+        <w:drawing>
+          <wp:inline xmlns:a="http://schemas.openxmlformats.org/drawingml/2006/main" xmlns:pic="http://schemas.openxmlformats.org/drawingml/2006/picture">
+            <wp:extent cx="2651760" cy="5739075"/>
+            <wp:docPr id="13" name="Picture 13"/>
+            <wp:cNvGraphicFramePr>
+              <a:graphicFrameLocks noChangeAspect="1"/>
+            </wp:cNvGraphicFramePr>
+            <a:graphic>
+              <a:graphicData uri="http://schemas.openxmlformats.org/drawingml/2006/picture">
+                <pic:pic>
+                  <pic:nvPicPr>
+                    <pic:cNvPr id="0" name="11-inventory.png"/>
+                    <pic:cNvPicPr/>
+                  </pic:nvPicPr>
+                  <pic:blipFill>
+                    <a:blip r:embed="rId21"/>
+                    <a:stretch>
+                      <a:fillRect/>
+                    </a:stretch>
+                  </pic:blipFill>
+                  <pic:spPr>
+                    <a:xfrm>
+                      <a:off x="0" y="0"/>
+                      <a:ext cx="2651760" cy="5739075"/>
+                    </a:xfrm>
+                    <a:prstGeom prst="rect"/>
+                  </pic:spPr>
+                </pic:pic>
+              </a:graphicData>
+            </a:graphic>
+          </wp:inline>
+        </w:drawing>
+      </w:r>
+    </w:p>
+    <w:p>
+      <w:pPr>
+        <w:spacing w:after="200"/>
+        <w:jc w:val="center"/>
+      </w:pPr>
+      <w:r>
+        <w:rPr>
+          <w:i/>
+          <w:color w:val="555555"/>
+          <w:sz w:val="18"/>
+        </w:rPr>
+        <w:t>The Inventory tab — apparatus and Quick Add grid.</w:t>
+      </w:r>
+    </w:p>
+    <w:p>
+      <w:pPr>
         <w:pStyle w:val="Heading2"/>
       </w:pPr>
       <w:r>
@@ -4203,6 +4905,60 @@
       </w:r>
       <w:r>
         <w:t xml:space="preserve"> — Options for managing local and synced data.</w:t>
+      </w:r>
+    </w:p>
+    <w:p>
+      <w:pPr>
+        <w:spacing w:before="120"/>
+        <w:jc w:val="center"/>
+      </w:pPr>
+      <w:r>
+        <w:drawing>
+          <wp:inline xmlns:a="http://schemas.openxmlformats.org/drawingml/2006/main" xmlns:pic="http://schemas.openxmlformats.org/drawingml/2006/picture">
+            <wp:extent cx="2651760" cy="5739075"/>
+            <wp:docPr id="14" name="Picture 14"/>
+            <wp:cNvGraphicFramePr>
+              <a:graphicFrameLocks noChangeAspect="1"/>
+            </wp:cNvGraphicFramePr>
+            <a:graphic>
+              <a:graphicData uri="http://schemas.openxmlformats.org/drawingml/2006/picture">
+                <pic:pic>
+                  <pic:nvPicPr>
+                    <pic:cNvPr id="0" name="12-settings.png"/>
+                    <pic:cNvPicPr/>
+                  </pic:nvPicPr>
+                  <pic:blipFill>
+                    <a:blip r:embed="rId22"/>
+                    <a:stretch>
+                      <a:fillRect/>
+                    </a:stretch>
+                  </pic:blipFill>
+                  <pic:spPr>
+                    <a:xfrm>
+                      <a:off x="0" y="0"/>
+                      <a:ext cx="2651760" cy="5739075"/>
+                    </a:xfrm>
+                    <a:prstGeom prst="rect"/>
+                  </pic:spPr>
+                </pic:pic>
+              </a:graphicData>
+            </a:graphic>
+          </wp:inline>
+        </w:drawing>
+      </w:r>
+    </w:p>
+    <w:p>
+      <w:pPr>
+        <w:spacing w:after="200"/>
+        <w:jc w:val="center"/>
+      </w:pPr>
+      <w:r>
+        <w:rPr>
+          <w:i/>
+          <w:color w:val="555555"/>
+          <w:sz w:val="18"/>
+        </w:rPr>
+        <w:t>The Settings tab.</w:t>
       </w:r>
     </w:p>
     <w:p>

</xml_diff>

<commit_message>
v3.22.0 — inventory integrity + measurement safety
Version bump (sw.js CACHE_NAME, index.html label, app.js APP_VERSION) + user
manual (.md + rebuilt .docx) + status narrative. Final scope after mid-build
descopes (#103 beams → Backlog, #123 Command breadcrumb → deferred to v4):
- #300 measurements floor to 1/8" (round down; ADR-012)
- #80 concurrent-deploy phantom-double descoped fixes + VERIFY PHYSICAL STRUT flag
- #284 behavior-preserving DRY of inventory deploy/return helpers

Co-Authored-By: Claude Opus 4.8 (1M context) <noreply@anthropic.com>
</commit_message>
<xml_diff>
--- a/docs/FieldStruts-User-Manual.docx
+++ b/docs/FieldStruts-User-Manual.docx
@@ -57,7 +57,7 @@
           <w:color w:val="1F3A5F"/>
           <w:sz w:val="24"/>
         </w:rPr>
-        <w:t>Version 3.21</w:t>
+        <w:t>Version 3.22</w:t>
       </w:r>
     </w:p>
     <w:p>
@@ -69,7 +69,7 @@
           <w:color w:val="555555"/>
           <w:sz w:val="24"/>
         </w:rPr>
-        <w:t>2026-05-25</w:t>
+        <w:t>2026-06-07</w:t>
       </w:r>
     </w:p>
     <w:p>
@@ -4974,6 +4974,77 @@
         <w:pStyle w:val="Heading2"/>
       </w:pPr>
       <w:r>
+        <w:t>Measurements Round Down to 1/8"</w:t>
+      </w:r>
+    </w:p>
+    <w:p>
+      <w:r>
+        <w:t xml:space="preserve">Cut lengths and strut set-to lengths now round </w:t>
+      </w:r>
+      <w:r>
+        <w:rPr>
+          <w:b/>
+        </w:rPr>
+        <w:t>down</w:t>
+      </w:r>
+      <w:r>
+        <w:t xml:space="preserve"> to the nearest 1/8 inch — you will never be told to cut or set *long*. When a length lands between marks it is shortened, because the loading wedge takes up that small gap, while a piece cut too long cannot seat. The deduction math still works from the exact plate and wood sizes; only the final number you act on is rounded, once, to a tape-readable 1/8".</w:t>
+      </w:r>
+    </w:p>
+    <w:p>
+      <w:pPr>
+        <w:pStyle w:val="Heading2"/>
+      </w:pPr>
+      <w:r>
+        <w:t>"Verify Physical Strut" Flag</w:t>
+      </w:r>
+    </w:p>
+    <w:p>
+      <w:r>
+        <w:t xml:space="preserve">If two crews deploy against the </w:t>
+      </w:r>
+      <w:r>
+        <w:rPr>
+          <w:b/>
+        </w:rPr>
+        <w:t>same</w:t>
+      </w:r>
+      <w:r>
+        <w:t xml:space="preserve"> strut at the same time while offline, the app could briefly count one strut as two. When the devices reconnect and the app detects this, it flags the affected shore point with a persistent amber </w:t>
+      </w:r>
+      <w:r>
+        <w:rPr>
+          <w:b/>
+        </w:rPr>
+        <w:t>VERIFY PHYSICAL STRUT</w:t>
+      </w:r>
+      <w:r>
+        <w:t xml:space="preserve"> badge instead of silently hiding the discrepancy. The flag stays until the </w:t>
+      </w:r>
+      <w:r>
+        <w:rPr>
+          <w:b/>
+        </w:rPr>
+        <w:t>IC or Safety</w:t>
+      </w:r>
+      <w:r>
+        <w:t xml:space="preserve"> taps </w:t>
+      </w:r>
+      <w:r>
+        <w:rPr>
+          <w:b/>
+        </w:rPr>
+        <w:t>Acknowledge</w:t>
+      </w:r>
+      <w:r>
+        <w:t xml:space="preserve"> — go put eyes on that shore point and confirm a real strut is in place before relying on it. A flagged shore point is not counted as secured on the Command dashboard until it is acknowledged.</w:t>
+      </w:r>
+    </w:p>
+    <w:p>
+      <w:pPr>
+        <w:pStyle w:val="Heading2"/>
+      </w:pPr>
+      <w:r>
         <w:t>Ending an Operation — Confirmation Gate</w:t>
       </w:r>
     </w:p>
@@ -5305,6 +5376,71 @@
                 <w:b/>
               </w:rPr>
               <w:t>Highlights</w:t>
+            </w:r>
+          </w:p>
+        </w:tc>
+      </w:tr>
+      <w:tr>
+        <w:tc>
+          <w:tcPr>
+            <w:tcW w:type="dxa" w:w="2880"/>
+          </w:tcPr>
+          <w:p>
+            <w:r/>
+            <w:r>
+              <w:rPr>
+                <w:b/>
+              </w:rPr>
+              <w:t>v3.22</w:t>
+            </w:r>
+          </w:p>
+        </w:tc>
+        <w:tc>
+          <w:tcPr>
+            <w:tcW w:type="dxa" w:w="2880"/>
+          </w:tcPr>
+          <w:p>
+            <w:r/>
+            <w:r>
+              <w:t>2026-06-07</w:t>
+            </w:r>
+          </w:p>
+        </w:tc>
+        <w:tc>
+          <w:tcPr>
+            <w:tcW w:type="dxa" w:w="2880"/>
+          </w:tcPr>
+          <w:p>
+            <w:r/>
+            <w:r>
+              <w:t xml:space="preserve">Inventory-integrity &amp; measurement-safety release. </w:t>
+            </w:r>
+            <w:r>
+              <w:rPr>
+                <w:b/>
+              </w:rPr>
+              <w:t>Measurements now round _down_ to 1/8"</w:t>
+            </w:r>
+            <w:r>
+              <w:t xml:space="preserve"> (cut and set-to lengths) so you are never told to cut long — short is taken up by the wedge (issue #300). </w:t>
+            </w:r>
+            <w:r>
+              <w:rPr>
+                <w:b/>
+              </w:rPr>
+              <w:t>Over-allocation safety flag:</w:t>
+            </w:r>
+            <w:r>
+              <w:t xml:space="preserve"> if two crews deploy the same strut at once while offline, on reconnect the app flags the shore point with a persistent </w:t>
+            </w:r>
+            <w:r>
+              <w:rPr>
+                <w:b/>
+              </w:rPr>
+              <w:t>VERIFY PHYSICAL STRUT</w:t>
+            </w:r>
+            <w:r>
+              <w:t xml:space="preserve"> badge (cleared only by IC / Safety) instead of silently losing count, and a flagged point is not counted as secured (issue #80). Under the hood: stronger validation on visiting-department equipment counts, and a clean-up of the inventory deploy/return code with no change in behavior (issue #284). _(Header/footer beams and the Command department breadcrumb were planned for this release but deferred.)_</w:t>
             </w:r>
           </w:p>
         </w:tc>

</xml_diff>